<commit_message>
Atualiza manual operacional v1.1 com UI atual (nav horizontal e abas).
Regenera prints das telas principais e documenta vantagens do sistema de abas no módulo Fila.

Co-authored-by: Cursor <cursoragent@cursor.com>
</commit_message>
<xml_diff>
--- a/docs/MANUAL_OPERACIONAL.docx
+++ b/docs/MANUAL_OPERACIONAL.docx
@@ -42,7 +42,7 @@
           <w:b w:val="0"/>
           <w:sz w:val="20"/>
         </w:rPr>
-        <w:t>Versão 1.0 — agosto/2026 · App: http://localhost:3047</w:t>
+        <w:t>Versão 1.1 — agosto/2026 · App: http://localhost:3047</w:t>
       </w:r>
     </w:p>
     <w:p>
@@ -137,7 +137,7 @@
           <w:b w:val="0"/>
           <w:sz w:val="22"/>
         </w:rPr>
-        <w:t>ADMIN — configuração completa (incluindo tipos de dependência).</w:t>
+        <w:t>ADMIN — configuração completa (incluindo tipos de dependência e usuários).</w:t>
       </w:r>
     </w:p>
     <w:p>
@@ -300,7 +300,7 @@
       <w:r>
         <w:drawing>
           <wp:inline xmlns:a="http://schemas.openxmlformats.org/drawingml/2006/main" xmlns:pic="http://schemas.openxmlformats.org/drawingml/2006/picture">
-            <wp:extent cx="5580000" cy="4647380"/>
+            <wp:extent cx="5580000" cy="3487500"/>
             <wp:docPr id="1" name="Picture 1"/>
             <wp:cNvGraphicFramePr>
               <a:graphicFrameLocks noChangeAspect="1"/>
@@ -321,7 +321,7 @@
                   <pic:spPr>
                     <a:xfrm>
                       <a:off x="0" y="0"/>
-                      <a:ext cx="5580000" cy="4647380"/>
+                      <a:ext cx="5580000" cy="3487500"/>
                     </a:xfrm>
                     <a:prstGeom prst="rect"/>
                   </pic:spPr>
@@ -358,7 +358,377 @@
           <w:color w:val="1E3A5F"/>
           <w:sz w:val="32"/>
         </w:rPr>
-        <w:t>2. Mapa planilha Excel ↔ POP ↔ sistema</w:t>
+        <w:t>2. Navegação (menu horizontal)</w:t>
+      </w:r>
+    </w:p>
+    <w:p>
+      <w:pPr>
+        <w:spacing w:after="160"/>
+      </w:pPr>
+      <w:r>
+        <w:rPr>
+          <w:rFonts w:ascii="Calibri" w:hAnsi="Calibri" w:eastAsia="Calibri"/>
+          <w:b w:val="0"/>
+          <w:sz w:val="22"/>
+        </w:rPr>
+        <w:t>Após o login, o sistema usa uma barra superior com módulos (não há menu lateral). O item ativo fica destacado; à direita aparecem o nome do usuário e o botão Sair. O logo / nome da marca ficam à esquerda (branding da instalação).</w:t>
+      </w:r>
+    </w:p>
+    <w:p>
+      <w:pPr>
+        <w:spacing w:after="160"/>
+      </w:pPr>
+      <w:r>
+        <w:rPr>
+          <w:rFonts w:ascii="Calibri" w:hAnsi="Calibri" w:eastAsia="Calibri"/>
+          <w:b/>
+          <w:sz w:val="22"/>
+        </w:rPr>
+        <w:t>Módulos do menu:</w:t>
+      </w:r>
+    </w:p>
+    <w:p>
+      <w:pPr>
+        <w:pStyle w:val="ListBullet"/>
+        <w:spacing w:after="40"/>
+      </w:pPr>
+      <w:r>
+        <w:rPr>
+          <w:rFonts w:ascii="Calibri" w:hAnsi="Calibri" w:eastAsia="Calibri"/>
+          <w:b w:val="0"/>
+          <w:sz w:val="22"/>
+        </w:rPr>
+        <w:t>FILA — lista de processos e detalhe (com abas internas; ver seção 3).</w:t>
+      </w:r>
+    </w:p>
+    <w:p>
+      <w:pPr>
+        <w:pStyle w:val="ListBullet"/>
+        <w:spacing w:after="40"/>
+      </w:pPr>
+      <w:r>
+        <w:rPr>
+          <w:rFonts w:ascii="Calibri" w:hAnsi="Calibri" w:eastAsia="Calibri"/>
+          <w:b w:val="0"/>
+          <w:sz w:val="22"/>
+        </w:rPr>
+        <w:t>DASHBOARD — produtividade (funil, gargalos, analistas).</w:t>
+      </w:r>
+    </w:p>
+    <w:p>
+      <w:pPr>
+        <w:pStyle w:val="ListBullet"/>
+        <w:spacing w:after="40"/>
+      </w:pPr>
+      <w:r>
+        <w:rPr>
+          <w:rFonts w:ascii="Calibri" w:hAnsi="Calibri" w:eastAsia="Calibri"/>
+          <w:b w:val="0"/>
+          <w:sz w:val="22"/>
+        </w:rPr>
+        <w:t>AGENDA — compromissos e integração Google Calendar.</w:t>
+      </w:r>
+    </w:p>
+    <w:p>
+      <w:pPr>
+        <w:pStyle w:val="ListBullet"/>
+        <w:spacing w:after="40"/>
+      </w:pPr>
+      <w:r>
+        <w:rPr>
+          <w:rFonts w:ascii="Calibri" w:hAnsi="Calibri" w:eastAsia="Calibri"/>
+          <w:b w:val="0"/>
+          <w:sz w:val="22"/>
+        </w:rPr>
+        <w:t>USUÁRIOS — gestão de usuários e grupos (ADMIN).</w:t>
+      </w:r>
+    </w:p>
+    <w:p>
+      <w:pPr>
+        <w:pStyle w:val="ListBullet"/>
+        <w:spacing w:after="40"/>
+      </w:pPr>
+      <w:r>
+        <w:rPr>
+          <w:rFonts w:ascii="Calibri" w:hAnsi="Calibri" w:eastAsia="Calibri"/>
+          <w:b w:val="0"/>
+          <w:sz w:val="22"/>
+        </w:rPr>
+        <w:t>CONFIG — tipos de dependência (“de quem depende”).</w:t>
+      </w:r>
+    </w:p>
+    <w:p>
+      <w:pPr>
+        <w:pStyle w:val="ListBullet"/>
+        <w:spacing w:after="40"/>
+      </w:pPr>
+      <w:r>
+        <w:rPr>
+          <w:rFonts w:ascii="Calibri" w:hAnsi="Calibri" w:eastAsia="Calibri"/>
+          <w:b w:val="0"/>
+          <w:sz w:val="22"/>
+        </w:rPr>
+        <w:t>CONTA — segurança (2FA) e integrações do usuário.</w:t>
+      </w:r>
+    </w:p>
+    <w:p>
+      <w:pPr>
+        <w:spacing w:after="160"/>
+      </w:pPr>
+      <w:r>
+        <w:rPr>
+          <w:rFonts w:ascii="Calibri" w:hAnsi="Calibri" w:eastAsia="Calibri"/>
+          <w:b w:val="0"/>
+          <w:sz w:val="22"/>
+        </w:rPr>
+        <w:t>Dica: o sistema lembra a última rota/filtros de cada módulo na sessão. Ao clicar de novo em FILA (ou outro módulo), você tende a voltar onde parou.</w:t>
+      </w:r>
+    </w:p>
+    <w:p>
+      <w:pPr>
+        <w:pStyle w:val="Heading1"/>
+      </w:pPr>
+      <w:r>
+        <w:rPr>
+          <w:rFonts w:ascii="Calibri" w:hAnsi="Calibri" w:eastAsia="Calibri"/>
+          <w:b/>
+          <w:color w:val="1E3A5F"/>
+          <w:sz w:val="32"/>
+        </w:rPr>
+        <w:t>3. Sistema de abas (módulo Fila)</w:t>
+      </w:r>
+    </w:p>
+    <w:p>
+      <w:pPr>
+        <w:spacing w:after="160"/>
+      </w:pPr>
+      <w:r>
+        <w:rPr>
+          <w:rFonts w:ascii="Calibri" w:hAnsi="Calibri" w:eastAsia="Calibri"/>
+          <w:b w:val="0"/>
+          <w:sz w:val="22"/>
+        </w:rPr>
+        <w:t>Dentro do módulo Fila, abaixo do menu horizontal, há uma barra de abas: a aba fixa “Fila” (sempre a primeira, sem botão fechar) e abas de processos abertos (número/nome do processo, com X para fechar).</w:t>
+      </w:r>
+    </w:p>
+    <w:p>
+      <w:pPr>
+        <w:spacing w:after="160"/>
+      </w:pPr>
+      <w:r>
+        <w:rPr>
+          <w:rFonts w:ascii="Calibri" w:hAnsi="Calibri" w:eastAsia="Calibri"/>
+          <w:b/>
+          <w:sz w:val="22"/>
+        </w:rPr>
+        <w:t>Vantagens no dia a dia:</w:t>
+      </w:r>
+    </w:p>
+    <w:p>
+      <w:pPr>
+        <w:pStyle w:val="ListBullet"/>
+        <w:spacing w:after="40"/>
+      </w:pPr>
+      <w:r>
+        <w:rPr>
+          <w:rFonts w:ascii="Calibri" w:hAnsi="Calibri" w:eastAsia="Calibri"/>
+          <w:b w:val="0"/>
+          <w:sz w:val="22"/>
+        </w:rPr>
+        <w:t>Vários processos abertos ao mesmo tempo — compare, copie dados ou alterne sem perder o que estava fazendo em cada um.</w:t>
+      </w:r>
+    </w:p>
+    <w:p>
+      <w:pPr>
+        <w:pStyle w:val="ListBullet"/>
+        <w:spacing w:after="40"/>
+      </w:pPr>
+      <w:r>
+        <w:rPr>
+          <w:rFonts w:ascii="Calibri" w:hAnsi="Calibri" w:eastAsia="Calibri"/>
+          <w:b w:val="0"/>
+          <w:sz w:val="22"/>
+        </w:rPr>
+        <w:t>Fila sempre acessível — a aba fixa “Fila” permanece; um clique volta à lista com filtros, sem “perder” os processos abertos.</w:t>
+      </w:r>
+    </w:p>
+    <w:p>
+      <w:pPr>
+        <w:pStyle w:val="ListBullet"/>
+        <w:spacing w:after="40"/>
+      </w:pPr>
+      <w:r>
+        <w:rPr>
+          <w:rFonts w:ascii="Calibri" w:hAnsi="Calibri" w:eastAsia="Calibri"/>
+          <w:b w:val="0"/>
+          <w:sz w:val="22"/>
+        </w:rPr>
+        <w:t>Não perde contexto ao alternar — troca rápida entre lista e detalhes (e entre processos) sem reabrir tudo do zero a cada clique.</w:t>
+      </w:r>
+    </w:p>
+    <w:p>
+      <w:pPr>
+        <w:pStyle w:val="ListBullet"/>
+        <w:spacing w:after="40"/>
+      </w:pPr>
+      <w:r>
+        <w:rPr>
+          <w:rFonts w:ascii="Calibri" w:hAnsi="Calibri" w:eastAsia="Calibri"/>
+          <w:b w:val="0"/>
+          <w:sz w:val="22"/>
+        </w:rPr>
+        <w:t>Abas só no módulo Fila — em Dashboard, Agenda, Usuários etc. a barra some para não poluir outras telas; as abas de processo continuam salvas e reaparecem ao voltar à Fila.</w:t>
+      </w:r>
+    </w:p>
+    <w:p>
+      <w:pPr>
+        <w:pStyle w:val="ListBullet"/>
+        <w:spacing w:after="40"/>
+      </w:pPr>
+      <w:r>
+        <w:rPr>
+          <w:rFonts w:ascii="Calibri" w:hAnsi="Calibri" w:eastAsia="Calibri"/>
+          <w:b w:val="0"/>
+          <w:sz w:val="22"/>
+        </w:rPr>
+        <w:t>Estado preservado ao voltar — as abas ficam em armazenamento local do navegador; fechar o detalhe com X remove só aquela aba.</w:t>
+      </w:r>
+    </w:p>
+    <w:p>
+      <w:pPr>
+        <w:spacing w:after="160"/>
+      </w:pPr>
+      <w:r>
+        <w:rPr>
+          <w:rFonts w:ascii="Calibri" w:hAnsi="Calibri" w:eastAsia="Calibri"/>
+          <w:b/>
+          <w:sz w:val="22"/>
+        </w:rPr>
+        <w:t>Como usar:</w:t>
+      </w:r>
+    </w:p>
+    <w:p>
+      <w:pPr>
+        <w:pStyle w:val="ListNumber"/>
+        <w:spacing w:after="40"/>
+      </w:pPr>
+      <w:r>
+        <w:rPr>
+          <w:rFonts w:ascii="Calibri" w:hAnsi="Calibri" w:eastAsia="Calibri"/>
+          <w:b w:val="0"/>
+          <w:sz w:val="22"/>
+        </w:rPr>
+        <w:t>Na Fila, clique no número do processo — abre o detalhe e cria uma aba.</w:t>
+      </w:r>
+    </w:p>
+    <w:p>
+      <w:pPr>
+        <w:pStyle w:val="ListNumber"/>
+        <w:spacing w:after="40"/>
+      </w:pPr>
+      <w:r>
+        <w:rPr>
+          <w:rFonts w:ascii="Calibri" w:hAnsi="Calibri" w:eastAsia="Calibri"/>
+          <w:b w:val="0"/>
+          <w:sz w:val="22"/>
+        </w:rPr>
+        <w:t>Abra outro processo da mesma forma; as abas ficam lado a lado.</w:t>
+      </w:r>
+    </w:p>
+    <w:p>
+      <w:pPr>
+        <w:pStyle w:val="ListNumber"/>
+        <w:spacing w:after="40"/>
+      </w:pPr>
+      <w:r>
+        <w:rPr>
+          <w:rFonts w:ascii="Calibri" w:hAnsi="Calibri" w:eastAsia="Calibri"/>
+          <w:b w:val="0"/>
+          <w:sz w:val="22"/>
+        </w:rPr>
+        <w:t>Clique numa aba de processo para alternar; clique em “Fila” para a lista.</w:t>
+      </w:r>
+    </w:p>
+    <w:p>
+      <w:pPr>
+        <w:pStyle w:val="ListNumber"/>
+        <w:spacing w:after="40"/>
+      </w:pPr>
+      <w:r>
+        <w:rPr>
+          <w:rFonts w:ascii="Calibri" w:hAnsi="Calibri" w:eastAsia="Calibri"/>
+          <w:b w:val="0"/>
+          <w:sz w:val="22"/>
+        </w:rPr>
+        <w:t>Use o X na aba para fechar aquele processo (a Fila nunca fecha).</w:t>
+      </w:r>
+    </w:p>
+    <w:p>
+      <w:pPr>
+        <w:jc w:val="center"/>
+      </w:pPr>
+      <w:r>
+        <w:drawing>
+          <wp:inline xmlns:a="http://schemas.openxmlformats.org/drawingml/2006/main" xmlns:pic="http://schemas.openxmlformats.org/drawingml/2006/picture">
+            <wp:extent cx="5580000" cy="3487500"/>
+            <wp:docPr id="2" name="Picture 2"/>
+            <wp:cNvGraphicFramePr>
+              <a:graphicFrameLocks noChangeAspect="1"/>
+            </wp:cNvGraphicFramePr>
+            <a:graphic>
+              <a:graphicData uri="http://schemas.openxmlformats.org/drawingml/2006/picture">
+                <pic:pic>
+                  <pic:nvPicPr>
+                    <pic:cNvPr id="0" name="11-abas-processos.png"/>
+                    <pic:cNvPicPr/>
+                  </pic:nvPicPr>
+                  <pic:blipFill>
+                    <a:blip r:embed="rId10"/>
+                    <a:stretch>
+                      <a:fillRect/>
+                    </a:stretch>
+                  </pic:blipFill>
+                  <pic:spPr>
+                    <a:xfrm>
+                      <a:off x="0" y="0"/>
+                      <a:ext cx="5580000" cy="3487500"/>
+                    </a:xfrm>
+                    <a:prstGeom prst="rect"/>
+                  </pic:spPr>
+                </pic:pic>
+              </a:graphicData>
+            </a:graphic>
+          </wp:inline>
+        </w:drawing>
+      </w:r>
+    </w:p>
+    <w:p>
+      <w:pPr>
+        <w:spacing w:after="240"/>
+        <w:jc w:val="center"/>
+      </w:pPr>
+      <w:r>
+        <w:rPr>
+          <w:rFonts w:ascii="Calibri" w:hAnsi="Calibri" w:eastAsia="Calibri"/>
+          <w:b w:val="0"/>
+          <w:color w:val="58595B"/>
+          <w:sz w:val="18"/>
+        </w:rPr>
+        <w:t>Figura 2 — Abas: Fila fixa + processos abertos</w:t>
+      </w:r>
+    </w:p>
+    <w:p>
+      <w:pPr>
+        <w:pStyle w:val="Heading1"/>
+      </w:pPr>
+      <w:r>
+        <w:rPr>
+          <w:rFonts w:ascii="Calibri" w:hAnsi="Calibri" w:eastAsia="Calibri"/>
+          <w:b/>
+          <w:color w:val="1E3A5F"/>
+          <w:sz w:val="32"/>
+        </w:rPr>
+        <w:t>4. Mapa planilha Excel ↔ POP ↔ sistema</w:t>
       </w:r>
     </w:p>
     <w:p>
@@ -1018,7 +1388,7 @@
           <w:b w:val="0"/>
           <w:sz w:val="22"/>
         </w:rPr>
-        <w:t>Dica: tipos novos de “de quem depende” (ex.: Corretor) se cadastram em Dependências — não é necessário criar uma fase nova para cada ator.</w:t>
+        <w:t>Dica: tipos novos de “de quem depende” (ex.: Corretor) se cadastram em CONFIG → Dependências — não é necessário criar uma fase nova para cada ator.</w:t>
       </w:r>
     </w:p>
     <w:p>
@@ -1032,7 +1402,7 @@
           <w:color w:val="1E3A5F"/>
           <w:sz w:val="32"/>
         </w:rPr>
-        <w:t>3. Fila de processos</w:t>
+        <w:t>5. Fila de processos</w:t>
       </w:r>
     </w:p>
     <w:p>
@@ -1072,7 +1442,7 @@
           <w:b w:val="0"/>
           <w:sz w:val="22"/>
         </w:rPr>
-        <w:t>No menu, clique em Fila.</w:t>
+        <w:t>No menu horizontal, clique em FILA.</w:t>
       </w:r>
     </w:p>
     <w:p>
@@ -1114,7 +1484,7 @@
           <w:b w:val="0"/>
           <w:sz w:val="22"/>
         </w:rPr>
-        <w:t>Clique no número do processo para abrir o detalhe.</w:t>
+        <w:t>Clique no número do processo para abrir o detalhe (abre uma aba).</w:t>
       </w:r>
     </w:p>
     <w:p>
@@ -1128,7 +1498,7 @@
           <w:b w:val="0"/>
           <w:sz w:val="22"/>
         </w:rPr>
-        <w:t>Use Exportar CSV para baixar a fila atual.</w:t>
+        <w:t>Use Exportar CSV para baixar a fila atual; Nova proposta / Importar Excel para entrada.</w:t>
       </w:r>
     </w:p>
     <w:p>
@@ -1151,8 +1521,8 @@
       <w:r>
         <w:drawing>
           <wp:inline xmlns:a="http://schemas.openxmlformats.org/drawingml/2006/main" xmlns:pic="http://schemas.openxmlformats.org/drawingml/2006/picture">
-            <wp:extent cx="5580000" cy="4647380"/>
-            <wp:docPr id="2" name="Picture 2"/>
+            <wp:extent cx="5580000" cy="3487500"/>
+            <wp:docPr id="3" name="Picture 3"/>
             <wp:cNvGraphicFramePr>
               <a:graphicFrameLocks noChangeAspect="1"/>
             </wp:cNvGraphicFramePr>
@@ -1164,7 +1534,7 @@
                     <pic:cNvPicPr/>
                   </pic:nvPicPr>
                   <pic:blipFill>
-                    <a:blip r:embed="rId10"/>
+                    <a:blip r:embed="rId11"/>
                     <a:stretch>
                       <a:fillRect/>
                     </a:stretch>
@@ -1172,7 +1542,7 @@
                   <pic:spPr>
                     <a:xfrm>
                       <a:off x="0" y="0"/>
-                      <a:ext cx="5580000" cy="4647380"/>
+                      <a:ext cx="5580000" cy="3487500"/>
                     </a:xfrm>
                     <a:prstGeom prst="rect"/>
                   </pic:spPr>
@@ -1195,7 +1565,7 @@
           <w:color w:val="58595B"/>
           <w:sz w:val="18"/>
         </w:rPr>
-        <w:t>Figura 2 — Fila de processos com fase e “Parado em”</w:t>
+        <w:t>Figura 3 — Fila com menu horizontal e barra de abas</w:t>
       </w:r>
     </w:p>
     <w:p>
@@ -1209,7 +1579,7 @@
           <w:color w:val="1E3A5F"/>
           <w:sz w:val="32"/>
         </w:rPr>
-        <w:t>4. Nova proposta</w:t>
+        <w:t>6. Nova proposta</w:t>
       </w:r>
     </w:p>
     <w:p>
@@ -1288,8 +1658,8 @@
       <w:r>
         <w:drawing>
           <wp:inline xmlns:a="http://schemas.openxmlformats.org/drawingml/2006/main" xmlns:pic="http://schemas.openxmlformats.org/drawingml/2006/picture">
-            <wp:extent cx="5580000" cy="4647380"/>
-            <wp:docPr id="3" name="Picture 3"/>
+            <wp:extent cx="5580000" cy="3487500"/>
+            <wp:docPr id="4" name="Picture 4"/>
             <wp:cNvGraphicFramePr>
               <a:graphicFrameLocks noChangeAspect="1"/>
             </wp:cNvGraphicFramePr>
@@ -1301,7 +1671,7 @@
                     <pic:cNvPicPr/>
                   </pic:nvPicPr>
                   <pic:blipFill>
-                    <a:blip r:embed="rId11"/>
+                    <a:blip r:embed="rId12"/>
                     <a:stretch>
                       <a:fillRect/>
                     </a:stretch>
@@ -1309,7 +1679,7 @@
                   <pic:spPr>
                     <a:xfrm>
                       <a:off x="0" y="0"/>
-                      <a:ext cx="5580000" cy="4647380"/>
+                      <a:ext cx="5580000" cy="3487500"/>
                     </a:xfrm>
                     <a:prstGeom prst="rect"/>
                   </pic:spPr>
@@ -1332,7 +1702,7 @@
           <w:color w:val="58595B"/>
           <w:sz w:val="18"/>
         </w:rPr>
-        <w:t>Figura 3 — Cadastro manual de proposta</w:t>
+        <w:t>Figura 4 — Cadastro manual de proposta</w:t>
       </w:r>
     </w:p>
     <w:p>
@@ -1346,7 +1716,7 @@
           <w:color w:val="1E3A5F"/>
           <w:sz w:val="32"/>
         </w:rPr>
-        <w:t>5. Detalhe — Pipeline (mudar fase)</w:t>
+        <w:t>7. Detalhe — Pipeline (mudar fase)</w:t>
       </w:r>
     </w:p>
     <w:p>
@@ -1373,7 +1743,7 @@
           <w:b w:val="0"/>
           <w:sz w:val="22"/>
         </w:rPr>
-        <w:t>Abra o processo na fila.</w:t>
+        <w:t>Abra o processo na fila (ou pela aba já aberta).</w:t>
       </w:r>
     </w:p>
     <w:p>
@@ -1434,6 +1804,20 @@
     </w:p>
     <w:p>
       <w:pPr>
+        <w:pStyle w:val="ListNumber"/>
+        <w:spacing w:after="40"/>
+      </w:pPr>
+      <w:r>
+        <w:rPr>
+          <w:rFonts w:ascii="Calibri" w:hAnsi="Calibri" w:eastAsia="Calibri"/>
+          <w:b w:val="0"/>
+          <w:sz w:val="22"/>
+        </w:rPr>
+        <w:t>O botão “Linha do tempo” (ao lado do título) mostra o histórico visual do processo.</w:t>
+      </w:r>
+    </w:p>
+    <w:p>
+      <w:pPr>
         <w:spacing w:after="160"/>
       </w:pPr>
       <w:r>
@@ -1452,8 +1836,8 @@
       <w:r>
         <w:drawing>
           <wp:inline xmlns:a="http://schemas.openxmlformats.org/drawingml/2006/main" xmlns:pic="http://schemas.openxmlformats.org/drawingml/2006/picture">
-            <wp:extent cx="5580000" cy="4647380"/>
-            <wp:docPr id="4" name="Picture 4"/>
+            <wp:extent cx="5580000" cy="3487500"/>
+            <wp:docPr id="5" name="Picture 5"/>
             <wp:cNvGraphicFramePr>
               <a:graphicFrameLocks noChangeAspect="1"/>
             </wp:cNvGraphicFramePr>
@@ -1461,11 +1845,11 @@
               <a:graphicData uri="http://schemas.openxmlformats.org/drawingml/2006/picture">
                 <pic:pic>
                   <pic:nvPicPr>
-                    <pic:cNvPr id="0" name="04-detalhe-pipeline-bloqueios.png"/>
+                    <pic:cNvPr id="0" name="11-abas-processos.png"/>
                     <pic:cNvPicPr/>
                   </pic:nvPicPr>
                   <pic:blipFill>
-                    <a:blip r:embed="rId12"/>
+                    <a:blip r:embed="rId10"/>
                     <a:stretch>
                       <a:fillRect/>
                     </a:stretch>
@@ -1473,7 +1857,7 @@
                   <pic:spPr>
                     <a:xfrm>
                       <a:off x="0" y="0"/>
-                      <a:ext cx="5580000" cy="4647380"/>
+                      <a:ext cx="5580000" cy="3487500"/>
                     </a:xfrm>
                     <a:prstGeom prst="rect"/>
                   </pic:spPr>
@@ -1496,7 +1880,7 @@
           <w:color w:val="58595B"/>
           <w:sz w:val="18"/>
         </w:rPr>
-        <w:t>Figura 4 — Painel Pipeline no detalhe do processo</w:t>
+        <w:t>Figura 5 — Detalhe do processo (Pipeline + abas)</w:t>
       </w:r>
     </w:p>
     <w:p>
@@ -1510,7 +1894,7 @@
           <w:color w:val="1E3A5F"/>
           <w:sz w:val="32"/>
         </w:rPr>
-        <w:t>6. Detalhe — Bloqueios (de quem depende)</w:t>
+        <w:t>8. Detalhe — Bloqueios (de quem depende)</w:t>
       </w:r>
     </w:p>
     <w:p>
@@ -1565,7 +1949,7 @@
           <w:b w:val="0"/>
           <w:sz w:val="22"/>
         </w:rPr>
-        <w:t>Clique em Registrar bloqueio — a fila passa a mostrar isso em “Parado em”.</w:t>
+        <w:t>Clique em Registrar / Abrir bloqueio — a fila passa a mostrar isso em “Parado em”.</w:t>
       </w:r>
     </w:p>
     <w:p>
@@ -1589,8 +1973,8 @@
       <w:r>
         <w:drawing>
           <wp:inline xmlns:a="http://schemas.openxmlformats.org/drawingml/2006/main" xmlns:pic="http://schemas.openxmlformats.org/drawingml/2006/picture">
-            <wp:extent cx="5580000" cy="4647380"/>
-            <wp:docPr id="5" name="Picture 5"/>
+            <wp:extent cx="5580000" cy="3487500"/>
+            <wp:docPr id="6" name="Picture 6"/>
             <wp:cNvGraphicFramePr>
               <a:graphicFrameLocks noChangeAspect="1"/>
             </wp:cNvGraphicFramePr>
@@ -1610,7 +1994,7 @@
                   <pic:spPr>
                     <a:xfrm>
                       <a:off x="0" y="0"/>
-                      <a:ext cx="5580000" cy="4647380"/>
+                      <a:ext cx="5580000" cy="3487500"/>
                     </a:xfrm>
                     <a:prstGeom prst="rect"/>
                   </pic:spPr>
@@ -1633,7 +2017,7 @@
           <w:color w:val="58595B"/>
           <w:sz w:val="18"/>
         </w:rPr>
-        <w:t>Figura 5 — Bloqueio aberto e formulário para registrar novo</w:t>
+        <w:t>Figura 6 — Bloqueio aberto e formulário para registrar novo</w:t>
       </w:r>
     </w:p>
     <w:p>
@@ -1647,7 +2031,7 @@
           <w:color w:val="1E3A5F"/>
           <w:sz w:val="32"/>
         </w:rPr>
-        <w:t>7. Checklist documental (Conformidade)</w:t>
+        <w:t>9. Checklist documental (Conformidade)</w:t>
       </w:r>
     </w:p>
     <w:p>
@@ -1674,7 +2058,7 @@
           <w:b w:val="0"/>
           <w:sz w:val="22"/>
         </w:rPr>
-        <w:t>Anexe o arquivo no item correspondente.</w:t>
+        <w:t>Na fase Conformidade (ou ao expandir o checklist), anexe o arquivo no item correspondente.</w:t>
       </w:r>
     </w:p>
     <w:p>
@@ -1740,8 +2124,8 @@
       <w:r>
         <w:drawing>
           <wp:inline xmlns:a="http://schemas.openxmlformats.org/drawingml/2006/main" xmlns:pic="http://schemas.openxmlformats.org/drawingml/2006/picture">
-            <wp:extent cx="5580000" cy="4647380"/>
-            <wp:docPr id="6" name="Picture 6"/>
+            <wp:extent cx="5580000" cy="3487500"/>
+            <wp:docPr id="7" name="Picture 7"/>
             <wp:cNvGraphicFramePr>
               <a:graphicFrameLocks noChangeAspect="1"/>
             </wp:cNvGraphicFramePr>
@@ -1761,7 +2145,7 @@
                   <pic:spPr>
                     <a:xfrm>
                       <a:off x="0" y="0"/>
-                      <a:ext cx="5580000" cy="4647380"/>
+                      <a:ext cx="5580000" cy="3487500"/>
                     </a:xfrm>
                     <a:prstGeom prst="rect"/>
                   </pic:spPr>
@@ -1784,7 +2168,7 @@
           <w:color w:val="58595B"/>
           <w:sz w:val="18"/>
         </w:rPr>
-        <w:t>Figura 6 — Checklist documental com validação automática</w:t>
+        <w:t>Figura 7 — Checklist documental com validação automática</w:t>
       </w:r>
     </w:p>
     <w:p>
@@ -1798,7 +2182,7 @@
           <w:color w:val="1E3A5F"/>
           <w:sz w:val="32"/>
         </w:rPr>
-        <w:t>8. Dashboard de produtividade</w:t>
+        <w:t>10. Dashboard de produtividade</w:t>
       </w:r>
     </w:p>
     <w:p>
@@ -1886,13 +2270,26 @@
     </w:p>
     <w:p>
       <w:pPr>
+        <w:spacing w:after="160"/>
+      </w:pPr>
+      <w:r>
+        <w:rPr>
+          <w:rFonts w:ascii="Calibri" w:hAnsi="Calibri" w:eastAsia="Calibri"/>
+          <w:b w:val="0"/>
+          <w:sz w:val="22"/>
+        </w:rPr>
+        <w:t>No menu horizontal, clique em DASHBOARD. Nesta tela a barra de abas da Fila não aparece (as abas de processo ficam guardadas e voltam ao reabrir FILA).</w:t>
+      </w:r>
+    </w:p>
+    <w:p>
+      <w:pPr>
         <w:jc w:val="center"/>
       </w:pPr>
       <w:r>
         <w:drawing>
           <wp:inline xmlns:a="http://schemas.openxmlformats.org/drawingml/2006/main" xmlns:pic="http://schemas.openxmlformats.org/drawingml/2006/picture">
-            <wp:extent cx="5580000" cy="4647380"/>
-            <wp:docPr id="7" name="Picture 7"/>
+            <wp:extent cx="5580000" cy="3487500"/>
+            <wp:docPr id="8" name="Picture 8"/>
             <wp:cNvGraphicFramePr>
               <a:graphicFrameLocks noChangeAspect="1"/>
             </wp:cNvGraphicFramePr>
@@ -1912,7 +2309,7 @@
                   <pic:spPr>
                     <a:xfrm>
                       <a:off x="0" y="0"/>
-                      <a:ext cx="5580000" cy="4647380"/>
+                      <a:ext cx="5580000" cy="3487500"/>
                     </a:xfrm>
                     <a:prstGeom prst="rect"/>
                   </pic:spPr>
@@ -1935,7 +2332,7 @@
           <w:color w:val="58595B"/>
           <w:sz w:val="18"/>
         </w:rPr>
-        <w:t>Figura 7 — Dashboard de produtividade</w:t>
+        <w:t>Figura 8 — Dashboard de produtividade</w:t>
       </w:r>
     </w:p>
     <w:p>
@@ -1949,7 +2346,7 @@
           <w:color w:val="1E3A5F"/>
           <w:sz w:val="32"/>
         </w:rPr>
-        <w:t>9. Tipos de dependência (coordenador/admin)</w:t>
+        <w:t>11. Tipos de dependência (CONFIG)</w:t>
       </w:r>
     </w:p>
     <w:p>
@@ -1976,7 +2373,7 @@
           <w:b w:val="0"/>
           <w:sz w:val="22"/>
         </w:rPr>
-        <w:t>Menu Dependências.</w:t>
+        <w:t>No menu horizontal, clique em CONFIG (Dependências).</w:t>
       </w:r>
     </w:p>
     <w:p>
@@ -2014,8 +2411,8 @@
       <w:r>
         <w:drawing>
           <wp:inline xmlns:a="http://schemas.openxmlformats.org/drawingml/2006/main" xmlns:pic="http://schemas.openxmlformats.org/drawingml/2006/picture">
-            <wp:extent cx="5580000" cy="4647380"/>
-            <wp:docPr id="8" name="Picture 8"/>
+            <wp:extent cx="5580000" cy="3487500"/>
+            <wp:docPr id="9" name="Picture 9"/>
             <wp:cNvGraphicFramePr>
               <a:graphicFrameLocks noChangeAspect="1"/>
             </wp:cNvGraphicFramePr>
@@ -2035,7 +2432,7 @@
                   <pic:spPr>
                     <a:xfrm>
                       <a:off x="0" y="0"/>
-                      <a:ext cx="5580000" cy="4647380"/>
+                      <a:ext cx="5580000" cy="3487500"/>
                     </a:xfrm>
                     <a:prstGeom prst="rect"/>
                   </pic:spPr>
@@ -2058,7 +2455,7 @@
           <w:color w:val="58595B"/>
           <w:sz w:val="18"/>
         </w:rPr>
-        <w:t>Figura 8 — Cadastro de tipos de dependência</w:t>
+        <w:t>Figura 9 — Cadastro de tipos de dependência</w:t>
       </w:r>
     </w:p>
     <w:p>
@@ -2072,7 +2469,155 @@
           <w:color w:val="1E3A5F"/>
           <w:sz w:val="32"/>
         </w:rPr>
-        <w:t>10. Roteiro do dia a dia (da entrada ao finalizado)</w:t>
+        <w:t>12. Usuários e Agenda (resumo)</w:t>
+      </w:r>
+    </w:p>
+    <w:p>
+      <w:pPr>
+        <w:spacing w:after="160"/>
+      </w:pPr>
+      <w:r>
+        <w:rPr>
+          <w:rFonts w:ascii="Calibri" w:hAnsi="Calibri" w:eastAsia="Calibri"/>
+          <w:b w:val="0"/>
+          <w:sz w:val="22"/>
+        </w:rPr>
+        <w:t>USUÁRIOS (ADMIN): cadastrar analistas/coordenadores, definir grupos e permissões de tela/ação.</w:t>
+      </w:r>
+    </w:p>
+    <w:p>
+      <w:pPr>
+        <w:jc w:val="center"/>
+      </w:pPr>
+      <w:r>
+        <w:drawing>
+          <wp:inline xmlns:a="http://schemas.openxmlformats.org/drawingml/2006/main" xmlns:pic="http://schemas.openxmlformats.org/drawingml/2006/picture">
+            <wp:extent cx="5580000" cy="3487500"/>
+            <wp:docPr id="10" name="Picture 10"/>
+            <wp:cNvGraphicFramePr>
+              <a:graphicFrameLocks noChangeAspect="1"/>
+            </wp:cNvGraphicFramePr>
+            <a:graphic>
+              <a:graphicData uri="http://schemas.openxmlformats.org/drawingml/2006/picture">
+                <pic:pic>
+                  <pic:nvPicPr>
+                    <pic:cNvPr id="0" name="09-usuarios.png"/>
+                    <pic:cNvPicPr/>
+                  </pic:nvPicPr>
+                  <pic:blipFill>
+                    <a:blip r:embed="rId17"/>
+                    <a:stretch>
+                      <a:fillRect/>
+                    </a:stretch>
+                  </pic:blipFill>
+                  <pic:spPr>
+                    <a:xfrm>
+                      <a:off x="0" y="0"/>
+                      <a:ext cx="5580000" cy="3487500"/>
+                    </a:xfrm>
+                    <a:prstGeom prst="rect"/>
+                  </pic:spPr>
+                </pic:pic>
+              </a:graphicData>
+            </a:graphic>
+          </wp:inline>
+        </w:drawing>
+      </w:r>
+    </w:p>
+    <w:p>
+      <w:pPr>
+        <w:spacing w:after="240"/>
+        <w:jc w:val="center"/>
+      </w:pPr>
+      <w:r>
+        <w:rPr>
+          <w:rFonts w:ascii="Calibri" w:hAnsi="Calibri" w:eastAsia="Calibri"/>
+          <w:b w:val="0"/>
+          <w:color w:val="58595B"/>
+          <w:sz w:val="18"/>
+        </w:rPr>
+        <w:t>Figura 10 — Gestão de usuários</w:t>
+      </w:r>
+    </w:p>
+    <w:p>
+      <w:pPr>
+        <w:spacing w:after="160"/>
+      </w:pPr>
+      <w:r>
+        <w:rPr>
+          <w:rFonts w:ascii="Calibri" w:hAnsi="Calibri" w:eastAsia="Calibri"/>
+          <w:b w:val="0"/>
+          <w:sz w:val="22"/>
+        </w:rPr>
+        <w:t>AGENDA: compromissos internos e, se conectado, Google Calendar (conta Gmail pessoal no MVP). Use CONTA → integrações para vincular o Google.</w:t>
+      </w:r>
+    </w:p>
+    <w:p>
+      <w:pPr>
+        <w:jc w:val="center"/>
+      </w:pPr>
+      <w:r>
+        <w:drawing>
+          <wp:inline xmlns:a="http://schemas.openxmlformats.org/drawingml/2006/main" xmlns:pic="http://schemas.openxmlformats.org/drawingml/2006/picture">
+            <wp:extent cx="5580000" cy="3487500"/>
+            <wp:docPr id="11" name="Picture 11"/>
+            <wp:cNvGraphicFramePr>
+              <a:graphicFrameLocks noChangeAspect="1"/>
+            </wp:cNvGraphicFramePr>
+            <a:graphic>
+              <a:graphicData uri="http://schemas.openxmlformats.org/drawingml/2006/picture">
+                <pic:pic>
+                  <pic:nvPicPr>
+                    <pic:cNvPr id="0" name="10-agenda.png"/>
+                    <pic:cNvPicPr/>
+                  </pic:nvPicPr>
+                  <pic:blipFill>
+                    <a:blip r:embed="rId18"/>
+                    <a:stretch>
+                      <a:fillRect/>
+                    </a:stretch>
+                  </pic:blipFill>
+                  <pic:spPr>
+                    <a:xfrm>
+                      <a:off x="0" y="0"/>
+                      <a:ext cx="5580000" cy="3487500"/>
+                    </a:xfrm>
+                    <a:prstGeom prst="rect"/>
+                  </pic:spPr>
+                </pic:pic>
+              </a:graphicData>
+            </a:graphic>
+          </wp:inline>
+        </w:drawing>
+      </w:r>
+    </w:p>
+    <w:p>
+      <w:pPr>
+        <w:spacing w:after="240"/>
+        <w:jc w:val="center"/>
+      </w:pPr>
+      <w:r>
+        <w:rPr>
+          <w:rFonts w:ascii="Calibri" w:hAnsi="Calibri" w:eastAsia="Calibri"/>
+          <w:b w:val="0"/>
+          <w:color w:val="58595B"/>
+          <w:sz w:val="18"/>
+        </w:rPr>
+        <w:t>Figura 11 — Agenda</w:t>
+      </w:r>
+    </w:p>
+    <w:p>
+      <w:pPr>
+        <w:pStyle w:val="Heading1"/>
+      </w:pPr>
+      <w:r>
+        <w:rPr>
+          <w:rFonts w:ascii="Calibri" w:hAnsi="Calibri" w:eastAsia="Calibri"/>
+          <w:b/>
+          <w:color w:val="1E3A5F"/>
+          <w:sz w:val="32"/>
+        </w:rPr>
+        <w:t>13. Roteiro do dia a dia (da entrada ao finalizado)</w:t>
       </w:r>
     </w:p>
     <w:p>
@@ -2183,6 +2728,20 @@
           <w:b w:val="0"/>
           <w:sz w:val="22"/>
         </w:rPr>
+        <w:t>Use as abas para manter 2–3 processos em paralelo sem perder a Fila.</w:t>
+      </w:r>
+    </w:p>
+    <w:p>
+      <w:pPr>
+        <w:pStyle w:val="ListNumber"/>
+        <w:spacing w:after="40"/>
+      </w:pPr>
+      <w:r>
+        <w:rPr>
+          <w:rFonts w:ascii="Calibri" w:hAnsi="Calibri" w:eastAsia="Calibri"/>
+          <w:b w:val="0"/>
+          <w:sz w:val="22"/>
+        </w:rPr>
         <w:t>Acompanhar gargalos no Dashboard; exportar CSV da fila se precisar reportar.</w:t>
       </w:r>
     </w:p>
@@ -2197,7 +2756,7 @@
           <w:color w:val="1E3A5F"/>
           <w:sz w:val="32"/>
         </w:rPr>
-        <w:t>11. Glossário rápido</w:t>
+        <w:t>14. Glossário rápido</w:t>
       </w:r>
     </w:p>
     <w:p>
@@ -2253,6 +2812,20 @@
           <w:b w:val="0"/>
           <w:sz w:val="22"/>
         </w:rPr>
+        <w:t>Aba Fila — aba fixa do módulo Fila; sempre disponível enquanto você está em Fila/processo.</w:t>
+      </w:r>
+    </w:p>
+    <w:p>
+      <w:pPr>
+        <w:pStyle w:val="ListBullet"/>
+        <w:spacing w:after="40"/>
+      </w:pPr>
+      <w:r>
+        <w:rPr>
+          <w:rFonts w:ascii="Calibri" w:hAnsi="Calibri" w:eastAsia="Calibri"/>
+          <w:b w:val="0"/>
+          <w:sz w:val="22"/>
+        </w:rPr>
         <w:t>Despachante — responsável externo de captação (texto, sem login).</w:t>
       </w:r>
     </w:p>
@@ -2323,7 +2896,7 @@
           <w:color w:val="1E3A5F"/>
           <w:sz w:val="32"/>
         </w:rPr>
-        <w:t>12. Dicas e erros comuns</w:t>
+        <w:t>15. Dicas e erros comuns</w:t>
       </w:r>
     </w:p>
     <w:p>
@@ -2393,7 +2966,35 @@
           <w:b w:val="0"/>
           <w:sz w:val="22"/>
         </w:rPr>
+        <w:t>Sumiram as abas? Elas só aparecem em FILA / detalhe de processo — volte pelo menu FILA.</w:t>
+      </w:r>
+    </w:p>
+    <w:p>
+      <w:pPr>
+        <w:pStyle w:val="ListBullet"/>
+        <w:spacing w:after="40"/>
+      </w:pPr>
+      <w:r>
+        <w:rPr>
+          <w:rFonts w:ascii="Calibri" w:hAnsi="Calibri" w:eastAsia="Calibri"/>
+          <w:b w:val="0"/>
+          <w:sz w:val="22"/>
+        </w:rPr>
         <w:t>Este Word é editável — atualize prints e textos conforme a operação evoluir.</w:t>
+      </w:r>
+    </w:p>
+    <w:p>
+      <w:pPr>
+        <w:pStyle w:val="ListBullet"/>
+        <w:spacing w:after="40"/>
+      </w:pPr>
+      <w:r>
+        <w:rPr>
+          <w:rFonts w:ascii="Calibri" w:hAnsi="Calibri" w:eastAsia="Calibri"/>
+          <w:b w:val="0"/>
+          <w:sz w:val="22"/>
+        </w:rPr>
+        <w:t>Regenerar este arquivo: python scripts/gerar-manual-operacional.py (prints: node scripts/capturar-prints-manual.mjs com o app em 3047).</w:t>
       </w:r>
     </w:p>
     <w:sectPr>

</xml_diff>